<commit_message>
Refaz Estudo de Situação 2x2 sobre o modelo original, preservando logo, cabeçalho e formatação
Co-Authored-By: Claude Opus 5.5 <noreply@anthropic.com>
Claude-Session: https://claude.ai/code/session_01JFjYnqJFVAR9FVH6t9NxKg
</commit_message>
<xml_diff>
--- a/estudo/ESTUDO_DE_SITUACAO_Operacao_2x2_10a_Edicao_nov2026-jan2027.docx
+++ b/estudo/ESTUDO_DE_SITUACAO_Operacao_2x2_10a_Edicao_nov2026-jan2027.docx
@@ -16,7 +16,74 @@
           <w:noProof/>
           <w:color w:val="000000" w:themeColor="text1"/>
         </w:rPr>
-        <w:t>ESTUDO DE SITUAÇÃO Nº ___/2026</w:t>
+        <mc:AlternateContent>
+          <mc:Choice Requires="wps">
+            <w:drawing>
+              <wp:anchor distT="0" distB="0" distL="114300" distR="114300" simplePos="0" relativeHeight="251661312" behindDoc="0" locked="0" layoutInCell="1" allowOverlap="1" wp14:anchorId="490ACBD5" wp14:editId="5E9646EA">
+                <wp:simplePos x="0" y="0"/>
+                <wp:positionH relativeFrom="column">
+                  <wp:posOffset>-706120</wp:posOffset>
+                </wp:positionH>
+                <wp:positionV relativeFrom="paragraph">
+                  <wp:posOffset>1040765</wp:posOffset>
+                </wp:positionV>
+                <wp:extent cx="6772275" cy="0"/>
+                <wp:effectExtent l="0" t="0" r="28575" b="19050"/>
+                <wp:wrapNone/>
+                <wp:docPr id="458" name="Conector reto 4"/>
+                <wp:cNvGraphicFramePr>
+                  <a:graphicFrameLocks xmlns:a="http://schemas.openxmlformats.org/drawingml/2006/main"/>
+                </wp:cNvGraphicFramePr>
+                <a:graphic xmlns:a="http://schemas.openxmlformats.org/drawingml/2006/main">
+                  <a:graphicData uri="http://schemas.microsoft.com/office/word/2010/wordprocessingShape">
+                    <wps:wsp>
+                      <wps:cNvCnPr>
+                        <a:cxnSpLocks noChangeShapeType="1"/>
+                      </wps:cNvCnPr>
+                      <wps:spPr bwMode="auto">
+                        <a:xfrm>
+                          <a:off x="0" y="0"/>
+                          <a:ext cx="6772275" cy="0"/>
+                        </a:xfrm>
+                        <a:prstGeom prst="line">
+                          <a:avLst/>
+                        </a:prstGeom>
+                        <a:noFill/>
+                        <a:ln w="9525">
+                          <a:solidFill>
+                            <a:srgbClr val="000000"/>
+                          </a:solidFill>
+                          <a:round/>
+                          <a:headEnd/>
+                          <a:tailEnd/>
+                        </a:ln>
+                        <a:extLst>
+                          <a:ext uri="{909E8E84-426E-40DD-AFC4-6F175D3DCCD1}">
+                            <a14:hiddenFill xmlns:a14="http://schemas.microsoft.com/office/drawing/2010/main">
+                              <a:noFill/>
+                            </a14:hiddenFill>
+                          </a:ext>
+                        </a:extLst>
+                      </wps:spPr>
+                      <wps:bodyPr/>
+                    </wps:wsp>
+                  </a:graphicData>
+                </a:graphic>
+                <wp14:sizeRelH relativeFrom="page">
+                  <wp14:pctWidth>0</wp14:pctWidth>
+                </wp14:sizeRelH>
+                <wp14:sizeRelV relativeFrom="page">
+                  <wp14:pctHeight>0</wp14:pctHeight>
+                </wp14:sizeRelV>
+              </wp:anchor>
+            </w:drawing>
+          </mc:Choice>
+          <mc:Fallback>
+            <w:pict>
+              <v:line w14:anchorId="56870D64" id="Conector reto 4" o:spid="_x0000_s1026" style="position:absolute;z-index:251661312;visibility:visible;mso-wrap-style:square;mso-width-percent:0;mso-height-percent:0;mso-wrap-distance-left:9pt;mso-wrap-distance-top:0;mso-wrap-distance-right:9pt;mso-wrap-distance-bottom:0;mso-position-horizontal:absolute;mso-position-horizontal-relative:text;mso-position-vertical:absolute;mso-position-vertical-relative:text;mso-width-percent:0;mso-height-percent:0;mso-width-relative:page;mso-height-relative:page" from="-55.6pt,81.95pt" to="477.65pt,81.95pt" o:gfxdata="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"/>
+            </w:pict>
+          </mc:Fallback>
+        </mc:AlternateContent>
       </w:r>
       <w:r>
         <w:rPr>
@@ -24,6 +91,54 @@
           <w:color w:val="000000" w:themeColor="text1"/>
           <w:sz w:val="20"/>
         </w:rPr>
+        <w:drawing>
+          <wp:inline distT="0" distB="0" distL="0" distR="0" wp14:anchorId="592F1E17" wp14:editId="775F1128">
+            <wp:extent cx="790575" cy="1343025"/>
+            <wp:effectExtent l="0" t="0" r="9525" b="9525"/>
+            <wp:docPr id="539240666" name="Imagem 5"/>
+            <wp:cNvGraphicFramePr>
+              <a:graphicFrameLocks xmlns:a="http://schemas.openxmlformats.org/drawingml/2006/main" noChangeAspect="1"/>
+            </wp:cNvGraphicFramePr>
+            <a:graphic xmlns:a="http://schemas.openxmlformats.org/drawingml/2006/main">
+              <a:graphicData uri="http://schemas.openxmlformats.org/drawingml/2006/picture">
+                <pic:pic xmlns:pic="http://schemas.openxmlformats.org/drawingml/2006/picture">
+                  <pic:nvPicPr>
+                    <pic:cNvPr id="0" name="Picture 1"/>
+                    <pic:cNvPicPr>
+                      <a:picLocks noChangeAspect="1" noChangeArrowheads="1"/>
+                    </pic:cNvPicPr>
+                  </pic:nvPicPr>
+                  <pic:blipFill>
+                    <a:blip r:embed="rId8">
+                      <a:extLst>
+                        <a:ext uri="{28A0092B-C50C-407E-A947-70E740481C1C}">
+                          <a14:useLocalDpi xmlns:a14="http://schemas.microsoft.com/office/drawing/2010/main" val="0"/>
+                        </a:ext>
+                      </a:extLst>
+                    </a:blip>
+                    <a:srcRect/>
+                    <a:stretch>
+                      <a:fillRect/>
+                    </a:stretch>
+                  </pic:blipFill>
+                  <pic:spPr bwMode="auto">
+                    <a:xfrm>
+                      <a:off x="0" y="0"/>
+                      <a:ext cx="790575" cy="1343025"/>
+                    </a:xfrm>
+                    <a:prstGeom prst="rect">
+                      <a:avLst/>
+                    </a:prstGeom>
+                    <a:noFill/>
+                    <a:ln>
+                      <a:noFill/>
+                    </a:ln>
+                  </pic:spPr>
+                </pic:pic>
+              </a:graphicData>
+            </a:graphic>
+          </wp:inline>
+        </w:drawing>
       </w:r>
       <w:r>
         <w:rPr>
@@ -32,6 +147,509 @@
           <w:szCs w:val="22"/>
           <w:lang w:eastAsia="pt-BR"/>
         </w:rPr>
+        <mc:AlternateContent>
+          <mc:Choice Requires="wps">
+            <w:drawing>
+              <wp:anchor distT="0" distB="0" distL="114300" distR="114300" simplePos="0" relativeHeight="251666432" behindDoc="0" locked="0" layoutInCell="1" allowOverlap="1" wp14:anchorId="7F6AB42F" wp14:editId="3B8F7EB6">
+                <wp:simplePos x="0" y="0"/>
+                <wp:positionH relativeFrom="column">
+                  <wp:posOffset>3154121</wp:posOffset>
+                </wp:positionH>
+                <wp:positionV relativeFrom="paragraph">
+                  <wp:posOffset>0</wp:posOffset>
+                </wp:positionV>
+                <wp:extent cx="2849245" cy="925449"/>
+                <wp:effectExtent l="0" t="0" r="8255" b="8255"/>
+                <wp:wrapNone/>
+                <wp:docPr id="510" name="Caixa de Texto 1"/>
+                <wp:cNvGraphicFramePr>
+                  <a:graphicFrameLocks xmlns:a="http://schemas.openxmlformats.org/drawingml/2006/main"/>
+                </wp:cNvGraphicFramePr>
+                <a:graphic xmlns:a="http://schemas.openxmlformats.org/drawingml/2006/main">
+                  <a:graphicData uri="http://schemas.microsoft.com/office/word/2010/wordprocessingShape">
+                    <wps:wsp>
+                      <wps:cNvSpPr txBox="1">
+                        <a:spLocks noChangeArrowheads="1"/>
+                      </wps:cNvSpPr>
+                      <wps:spPr bwMode="auto">
+                        <a:xfrm>
+                          <a:off x="0" y="0"/>
+                          <a:ext cx="2849245" cy="925449"/>
+                        </a:xfrm>
+                        <a:prstGeom prst="rect">
+                          <a:avLst/>
+                        </a:prstGeom>
+                        <a:solidFill>
+                          <a:srgbClr val="FFFFFF"/>
+                        </a:solidFill>
+                        <a:ln>
+                          <a:noFill/>
+                        </a:ln>
+                        <a:extLst>
+                          <a:ext uri="{91240B29-F687-4F45-9708-019B960494DF}">
+                            <a14:hiddenLine xmlns:a14="http://schemas.microsoft.com/office/drawing/2010/main" w="9525">
+                              <a:solidFill>
+                                <a:srgbClr val="000000"/>
+                              </a:solidFill>
+                              <a:miter lim="800000"/>
+                              <a:headEnd/>
+                              <a:tailEnd/>
+                            </a14:hiddenLine>
+                          </a:ext>
+                        </a:extLst>
+                      </wps:spPr>
+                      <wps:txbx>
+                        <w:txbxContent>
+                          <w:p>
+                            <w:pPr>
+                              <w:spacing w:before="60" w:after="60" w:line="360" w:lineRule="auto"/>
+                              <w:jc w:val="center"/>
+                              <w:rPr>
+                                <w:rFonts w:ascii="Verdana" w:hAnsi="Verdana" w:cs="Arial"/>
+                                <w:b/>
+                                <w:iCs/>
+                                <w:caps/>
+                                <w:sz w:val="16"/>
+                                <w:szCs w:val="16"/>
+                              </w:rPr>
+                            </w:pPr>
+                            <w:r>
+                              <w:rPr>
+                                <w:rFonts w:ascii="Verdana" w:hAnsi="Verdana" w:cs="Arial"/>
+                                <w:b/>
+                                <w:iCs/>
+                                <w:caps/>
+                                <w:sz w:val="16"/>
+                                <w:szCs w:val="16"/>
+                              </w:rPr>
+                              <w:t>Luís eduardo magalhães</w:t>
+                            </w:r>
+                            <w:r>
+                              <w:rPr>
+                                <w:rFonts w:ascii="Verdana" w:hAnsi="Verdana" w:cs="Arial"/>
+                                <w:b/>
+                                <w:iCs/>
+                                <w:caps/>
+                                <w:sz w:val="16"/>
+                                <w:szCs w:val="16"/>
+                              </w:rPr>
+                              <w:t>– Bahia</w:t>
+                            </w:r>
+                          </w:p>
+                          <w:p>
+                            <w:pPr>
+                              <w:spacing w:before="60" w:after="60" w:line="360" w:lineRule="auto"/>
+                              <w:jc w:val="center"/>
+                              <w:rPr>
+                                <w:rFonts w:ascii="Verdana" w:hAnsi="Verdana" w:cs="Arial"/>
+                                <w:b/>
+                                <w:i/>
+                                <w:iCs/>
+                                <w:color w:val="000000" w:themeColor="text1"/>
+                                <w:sz w:val="16"/>
+                                <w:szCs w:val="16"/>
+                              </w:rPr>
+                            </w:pPr>
+                            <w:r>
+                              <w:rPr>
+                                <w:rFonts w:ascii="Verdana" w:hAnsi="Verdana" w:cs="Arial"/>
+                                <w:b/>
+                                <w:i/>
+                                <w:iCs/>
+                                <w:color w:val="000000" w:themeColor="text1"/>
+                                <w:sz w:val="16"/>
+                                <w:szCs w:val="16"/>
+                              </w:rPr>
+                              <w:t>“</w:t>
+                            </w:r>
+                            <w:r>
+                              <w:rPr>
+                                <w:rFonts w:ascii="Verdana" w:hAnsi="Verdana" w:cs="Arial"/>
+                                <w:b/>
+                                <w:i/>
+                                <w:iCs/>
+                                <w:color w:val="000000" w:themeColor="text1"/>
+                                <w:sz w:val="16"/>
+                                <w:szCs w:val="16"/>
+                              </w:rPr>
+                              <w:t>Operação 2x2</w:t>
+                            </w:r>
+                            <w:r>
+                              <w:rPr>
+                                <w:rFonts w:ascii="Verdana" w:hAnsi="Verdana" w:cs="Arial"/>
+                                <w:b/>
+                                <w:i/>
+                                <w:iCs/>
+                                <w:color w:val="000000" w:themeColor="text1"/>
+                                <w:sz w:val="16"/>
+                                <w:szCs w:val="16"/>
+                              </w:rPr>
+                              <w:t>”</w:t>
+                            </w:r>
+                          </w:p>
+                          <w:p>
+                            <w:pPr>
+                              <w:spacing w:before="60" w:after="60" w:line="360" w:lineRule="auto"/>
+                              <w:jc w:val="center"/>
+                              <w:rPr>
+                                <w:rFonts w:ascii="Verdana" w:hAnsi="Verdana" w:cs="Arial"/>
+                                <w:b/>
+                                <w:iCs/>
+                                <w:color w:val="000000" w:themeColor="text1"/>
+                                <w:sz w:val="16"/>
+                                <w:szCs w:val="16"/>
+                              </w:rPr>
+                            </w:pPr>
+                            <w:r>
+                              <w:rPr>
+                                <w:rFonts w:ascii="Verdana" w:hAnsi="Verdana" w:cs="Arial"/>
+                                <w:b/>
+                                <w:i/>
+                                <w:iCs/>
+                                <w:color w:val="000000" w:themeColor="text1"/>
+                                <w:sz w:val="16"/>
+                                <w:szCs w:val="16"/>
+                              </w:rPr>
+                              <w:t xml:space="preserve">Quartel ao </w:t>
+                            </w:r>
+                            <w:r>
+                              <w:rPr>
+                                <w:rFonts w:ascii="Verdana" w:hAnsi="Verdana" w:cs="Arial"/>
+                                <w:b/>
+                                <w:i/>
+                                <w:iCs/>
+                                <w:color w:val="000000" w:themeColor="text1"/>
+                                <w:sz w:val="16"/>
+                                <w:szCs w:val="16"/>
+                              </w:rPr>
+                              <w:t>22 </w:t>
+                            </w:r>
+                            <w:r>
+                              <w:rPr>
+                                <w:rFonts w:ascii="Verdana" w:hAnsi="Verdana" w:cs="Arial"/>
+                                <w:b/>
+                                <w:i/>
+                                <w:iCs/>
+                                <w:color w:val="000000" w:themeColor="text1"/>
+                                <w:sz w:val="16"/>
+                                <w:szCs w:val="16"/>
+                              </w:rPr>
+                              <w:t xml:space="preserve"> </w:t>
+                            </w:r>
+                            <w:r>
+                              <w:rPr>
+                                <w:rFonts w:ascii="Verdana" w:hAnsi="Verdana" w:cs="Arial"/>
+                                <w:b/>
+                                <w:i/>
+                                <w:iCs/>
+                                <w:color w:val="000000" w:themeColor="text1"/>
+                                <w:sz w:val="16"/>
+                                <w:szCs w:val="16"/>
+                              </w:rPr>
+                              <w:t>de</w:t>
+                            </w:r>
+                            <w:r>
+                              <w:rPr>
+                                <w:rFonts w:ascii="Verdana" w:hAnsi="Verdana" w:cs="Arial"/>
+                                <w:b/>
+                                <w:i/>
+                                <w:iCs/>
+                                <w:color w:val="000000" w:themeColor="text1"/>
+                                <w:sz w:val="16"/>
+                                <w:szCs w:val="16"/>
+                              </w:rPr>
+                              <w:t xml:space="preserve"> </w:t>
+                            </w:r>
+                            <w:r>
+                              <w:rPr>
+                                <w:rFonts w:ascii="Verdana" w:hAnsi="Verdana" w:cs="Arial"/>
+                                <w:b/>
+                                <w:i/>
+                                <w:iCs/>
+                                <w:color w:val="000000" w:themeColor="text1"/>
+                                <w:sz w:val="16"/>
+                                <w:szCs w:val="16"/>
+                              </w:rPr>
+                              <w:t>outubro</w:t>
+                            </w:r>
+                            <w:r>
+                              <w:rPr>
+                                <w:rFonts w:ascii="Verdana" w:hAnsi="Verdana" w:cs="Arial"/>
+                                <w:b/>
+                                <w:i/>
+                                <w:iCs/>
+                                <w:color w:val="000000" w:themeColor="text1"/>
+                                <w:sz w:val="16"/>
+                                <w:szCs w:val="16"/>
+                              </w:rPr>
+                              <w:t xml:space="preserve"> de 202</w:t>
+                            </w:r>
+                            <w:r>
+                              <w:rPr>
+                                <w:rFonts w:ascii="Verdana" w:hAnsi="Verdana" w:cs="Arial"/>
+                                <w:b/>
+                                <w:i/>
+                                <w:iCs/>
+                                <w:color w:val="000000" w:themeColor="text1"/>
+                                <w:sz w:val="16"/>
+                                <w:szCs w:val="16"/>
+                              </w:rPr>
+                              <w:t>6</w:t>
+                            </w:r>
+                            <w:r>
+                              <w:rPr>
+                                <w:rFonts w:ascii="Verdana" w:hAnsi="Verdana" w:cs="Arial"/>
+                                <w:b/>
+                                <w:i/>
+                                <w:iCs/>
+                                <w:color w:val="000000" w:themeColor="text1"/>
+                                <w:sz w:val="16"/>
+                                <w:szCs w:val="16"/>
+                              </w:rPr>
+                              <w:t>.</w:t>
+                            </w:r>
+                          </w:p>
+                        </w:txbxContent>
+                      </wps:txbx>
+                      <wps:bodyPr rot="0" vert="horz" wrap="square" lIns="91440" tIns="45720" rIns="91440" bIns="45720" anchor="t" anchorCtr="0" upright="1">
+                        <a:noAutofit/>
+                      </wps:bodyPr>
+                    </wps:wsp>
+                  </a:graphicData>
+                </a:graphic>
+                <wp14:sizeRelH relativeFrom="page">
+                  <wp14:pctWidth>0</wp14:pctWidth>
+                </wp14:sizeRelH>
+                <wp14:sizeRelV relativeFrom="page">
+                  <wp14:pctHeight>0</wp14:pctHeight>
+                </wp14:sizeRelV>
+              </wp:anchor>
+            </w:drawing>
+          </mc:Choice>
+          <mc:Fallback>
+            <w:pict>
+              <v:shapetype w14:anchorId="7F6AB42F" id="_x0000_t202" coordsize="21600,21600" o:spt="202" path="m,l,21600r21600,l21600,xe">
+                <v:stroke joinstyle="miter"/>
+                <v:path gradientshapeok="t" o:connecttype="rect"/>
+              </v:shapetype>
+              <v:shape id="Caixa de Texto 1" o:spid="_x0000_s1026" type="#_x0000_t202" style="position:absolute;left:0;text-align:left;margin-left:248.35pt;margin-top:0;width:224.35pt;height:72.85pt;z-index:251666432;visibility:visible;mso-wrap-style:square;mso-width-percent:0;mso-height-percent:0;mso-wrap-distance-left:9pt;mso-wrap-distance-top:0;mso-wrap-distance-right:9pt;mso-wrap-distance-bottom:0;mso-position-horizontal:absolute;mso-position-horizontal-relative:text;mso-position-vertical:absolute;mso-position-vertical-relative:text;mso-width-percent:0;mso-height-percent:0;mso-width-relative:page;mso-height-relative:page;v-text-anchor:top" o:gfxdata="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" stroked="f">
+                <v:textbox>
+                  <w:txbxContent>
+                    <w:p>
+                      <w:pPr>
+                        <w:spacing w:before="60" w:after="60" w:line="360" w:lineRule="auto"/>
+                        <w:jc w:val="center"/>
+                        <w:rPr>
+                          <w:rFonts w:ascii="Verdana" w:hAnsi="Verdana" w:cs="Arial"/>
+                          <w:b/>
+                          <w:iCs/>
+                          <w:caps/>
+                          <w:sz w:val="16"/>
+                          <w:szCs w:val="16"/>
+                        </w:rPr>
+                      </w:pPr>
+                      <w:r>
+                        <w:rPr>
+                          <w:rFonts w:ascii="Verdana" w:hAnsi="Verdana" w:cs="Arial"/>
+                          <w:b/>
+                          <w:iCs/>
+                          <w:caps/>
+                          <w:sz w:val="16"/>
+                          <w:szCs w:val="16"/>
+                        </w:rPr>
+                        <w:t>Luís eduardo magalhães</w:t>
+                      </w:r>
+                      <w:r>
+                        <w:rPr>
+                          <w:rFonts w:ascii="Verdana" w:hAnsi="Verdana" w:cs="Arial"/>
+                          <w:b/>
+                          <w:iCs/>
+                          <w:caps/>
+                          <w:sz w:val="16"/>
+                          <w:szCs w:val="16"/>
+                        </w:rPr>
+                        <w:t>– Bahia</w:t>
+                      </w:r>
+                    </w:p>
+                    <w:p>
+                      <w:pPr>
+                        <w:spacing w:before="60" w:after="60" w:line="360" w:lineRule="auto"/>
+                        <w:jc w:val="center"/>
+                        <w:rPr>
+                          <w:rFonts w:ascii="Verdana" w:hAnsi="Verdana" w:cs="Arial"/>
+                          <w:b/>
+                          <w:i/>
+                          <w:iCs/>
+                          <w:color w:val="000000" w:themeColor="text1"/>
+                          <w:sz w:val="16"/>
+                          <w:szCs w:val="16"/>
+                        </w:rPr>
+                      </w:pPr>
+                      <w:r>
+                        <w:rPr>
+                          <w:rFonts w:ascii="Verdana" w:hAnsi="Verdana" w:cs="Arial"/>
+                          <w:b/>
+                          <w:i/>
+                          <w:iCs/>
+                          <w:color w:val="000000" w:themeColor="text1"/>
+                          <w:sz w:val="16"/>
+                          <w:szCs w:val="16"/>
+                        </w:rPr>
+                        <w:t>“</w:t>
+                      </w:r>
+                      <w:r>
+                        <w:rPr>
+                          <w:rFonts w:ascii="Verdana" w:hAnsi="Verdana" w:cs="Arial"/>
+                          <w:b/>
+                          <w:i/>
+                          <w:iCs/>
+                          <w:color w:val="000000" w:themeColor="text1"/>
+                          <w:sz w:val="16"/>
+                          <w:szCs w:val="16"/>
+                        </w:rPr>
+                        <w:t>Operação 2x2</w:t>
+                      </w:r>
+                      <w:r>
+                        <w:rPr>
+                          <w:rFonts w:ascii="Verdana" w:hAnsi="Verdana" w:cs="Arial"/>
+                          <w:b/>
+                          <w:i/>
+                          <w:iCs/>
+                          <w:color w:val="000000" w:themeColor="text1"/>
+                          <w:sz w:val="16"/>
+                          <w:szCs w:val="16"/>
+                        </w:rPr>
+                        <w:t>”</w:t>
+                      </w:r>
+                    </w:p>
+                    <w:p>
+                      <w:pPr>
+                        <w:spacing w:before="60" w:after="60" w:line="360" w:lineRule="auto"/>
+                        <w:jc w:val="center"/>
+                        <w:rPr>
+                          <w:rFonts w:ascii="Verdana" w:hAnsi="Verdana" w:cs="Arial"/>
+                          <w:b/>
+                          <w:iCs/>
+                          <w:color w:val="000000" w:themeColor="text1"/>
+                          <w:sz w:val="16"/>
+                          <w:szCs w:val="16"/>
+                        </w:rPr>
+                      </w:pPr>
+                      <w:r>
+                        <w:rPr>
+                          <w:rFonts w:ascii="Verdana" w:hAnsi="Verdana" w:cs="Arial"/>
+                          <w:b/>
+                          <w:i/>
+                          <w:iCs/>
+                          <w:color w:val="000000" w:themeColor="text1"/>
+                          <w:sz w:val="16"/>
+                          <w:szCs w:val="16"/>
+                        </w:rPr>
+                        <w:t xml:space="preserve">Quartel ao </w:t>
+                      </w:r>
+                      <w:r>
+                        <w:rPr>
+                          <w:rFonts w:ascii="Verdana" w:hAnsi="Verdana" w:cs="Arial"/>
+                          <w:b/>
+                          <w:i/>
+                          <w:iCs/>
+                          <w:color w:val="000000" w:themeColor="text1"/>
+                          <w:sz w:val="16"/>
+                          <w:szCs w:val="16"/>
+                        </w:rPr>
+                        <w:t>22 </w:t>
+                      </w:r>
+                      <w:r>
+                        <w:rPr>
+                          <w:rFonts w:ascii="Verdana" w:hAnsi="Verdana" w:cs="Arial"/>
+                          <w:b/>
+                          <w:i/>
+                          <w:iCs/>
+                          <w:color w:val="000000" w:themeColor="text1"/>
+                          <w:sz w:val="16"/>
+                          <w:szCs w:val="16"/>
+                        </w:rPr>
+                        <w:t xml:space="preserve"> </w:t>
+                      </w:r>
+                      <w:r>
+                        <w:rPr>
+                          <w:rFonts w:ascii="Verdana" w:hAnsi="Verdana" w:cs="Arial"/>
+                          <w:b/>
+                          <w:i/>
+                          <w:iCs/>
+                          <w:color w:val="000000" w:themeColor="text1"/>
+                          <w:sz w:val="16"/>
+                          <w:szCs w:val="16"/>
+                        </w:rPr>
+                        <w:t>de</w:t>
+                      </w:r>
+                      <w:r>
+                        <w:rPr>
+                          <w:rFonts w:ascii="Verdana" w:hAnsi="Verdana" w:cs="Arial"/>
+                          <w:b/>
+                          <w:i/>
+                          <w:iCs/>
+                          <w:color w:val="000000" w:themeColor="text1"/>
+                          <w:sz w:val="16"/>
+                          <w:szCs w:val="16"/>
+                        </w:rPr>
+                        <w:t xml:space="preserve"> </w:t>
+                      </w:r>
+                      <w:r>
+                        <w:rPr>
+                          <w:rFonts w:ascii="Verdana" w:hAnsi="Verdana" w:cs="Arial"/>
+                          <w:b/>
+                          <w:i/>
+                          <w:iCs/>
+                          <w:color w:val="000000" w:themeColor="text1"/>
+                          <w:sz w:val="16"/>
+                          <w:szCs w:val="16"/>
+                        </w:rPr>
+                        <w:t>outubro</w:t>
+                      </w:r>
+                      <w:r>
+                        <w:rPr>
+                          <w:rFonts w:ascii="Verdana" w:hAnsi="Verdana" w:cs="Arial"/>
+                          <w:b/>
+                          <w:i/>
+                          <w:iCs/>
+                          <w:color w:val="000000" w:themeColor="text1"/>
+                          <w:sz w:val="16"/>
+                          <w:szCs w:val="16"/>
+                        </w:rPr>
+                        <w:t xml:space="preserve"> de 202</w:t>
+                      </w:r>
+                      <w:r>
+                        <w:rPr>
+                          <w:rFonts w:ascii="Verdana" w:hAnsi="Verdana" w:cs="Arial"/>
+                          <w:b/>
+                          <w:i/>
+                          <w:iCs/>
+                          <w:color w:val="000000" w:themeColor="text1"/>
+                          <w:sz w:val="16"/>
+                          <w:szCs w:val="16"/>
+                        </w:rPr>
+                        <w:t>6</w:t>
+                      </w:r>
+                      <w:r>
+                        <w:rPr>
+                          <w:rFonts w:ascii="Verdana" w:hAnsi="Verdana" w:cs="Arial"/>
+                          <w:b/>
+                          <w:i/>
+                          <w:iCs/>
+                          <w:color w:val="000000" w:themeColor="text1"/>
+                          <w:sz w:val="16"/>
+                          <w:szCs w:val="16"/>
+                        </w:rPr>
+                        <w:t>.</w:t>
+                      </w:r>
+                    </w:p>
+                  </w:txbxContent>
+                </v:textbox>
+              </v:shape>
+            </w:pict>
+          </mc:Fallback>
+        </mc:AlternateContent>
       </w:r>
       <w:r>
         <w:rPr>
@@ -40,6 +658,295 @@
           <w:color w:val="000000" w:themeColor="text1"/>
           <w:lang w:eastAsia="pt-BR"/>
         </w:rPr>
+        <mc:AlternateContent>
+          <mc:Choice Requires="wps">
+            <w:drawing>
+              <wp:anchor distT="0" distB="0" distL="114300" distR="114300" simplePos="0" relativeHeight="251660288" behindDoc="0" locked="0" layoutInCell="1" allowOverlap="1" wp14:anchorId="0AFCEDE7" wp14:editId="243F6BF8">
+                <wp:simplePos x="0" y="0"/>
+                <wp:positionH relativeFrom="column">
+                  <wp:posOffset>-245898</wp:posOffset>
+                </wp:positionH>
+                <wp:positionV relativeFrom="paragraph">
+                  <wp:posOffset>2210</wp:posOffset>
+                </wp:positionV>
+                <wp:extent cx="4196741" cy="962025"/>
+                <wp:effectExtent l="0" t="0" r="0" b="9525"/>
+                <wp:wrapNone/>
+                <wp:docPr id="478" name="Caixa de Texto 2"/>
+                <wp:cNvGraphicFramePr>
+                  <a:graphicFrameLocks xmlns:a="http://schemas.openxmlformats.org/drawingml/2006/main"/>
+                </wp:cNvGraphicFramePr>
+                <a:graphic xmlns:a="http://schemas.openxmlformats.org/drawingml/2006/main">
+                  <a:graphicData uri="http://schemas.microsoft.com/office/word/2010/wordprocessingShape">
+                    <wps:wsp>
+                      <wps:cNvSpPr txBox="1">
+                        <a:spLocks noChangeArrowheads="1"/>
+                      </wps:cNvSpPr>
+                      <wps:spPr bwMode="auto">
+                        <a:xfrm>
+                          <a:off x="0" y="0"/>
+                          <a:ext cx="4196741" cy="962025"/>
+                        </a:xfrm>
+                        <a:prstGeom prst="rect">
+                          <a:avLst/>
+                        </a:prstGeom>
+                        <a:solidFill>
+                          <a:srgbClr val="FFFFFF"/>
+                        </a:solidFill>
+                        <a:ln>
+                          <a:noFill/>
+                        </a:ln>
+                        <a:extLst>
+                          <a:ext uri="{91240B29-F687-4F45-9708-019B960494DF}">
+                            <a14:hiddenLine xmlns:a14="http://schemas.microsoft.com/office/drawing/2010/main" w="9525">
+                              <a:solidFill>
+                                <a:srgbClr val="000000"/>
+                              </a:solidFill>
+                              <a:miter lim="800000"/>
+                              <a:headEnd/>
+                              <a:tailEnd/>
+                            </a14:hiddenLine>
+                          </a:ext>
+                        </a:extLst>
+                      </wps:spPr>
+                      <wps:txbx>
+                        <w:txbxContent>
+                          <w:p>
+                            <w:pPr>
+                              <w:spacing w:after="60"/>
+                              <w:jc w:val="center"/>
+                              <w:rPr>
+                                <w:rFonts w:ascii="Verdana" w:hAnsi="Verdana" w:cs="Arial"/>
+                                <w:b/>
+                                <w:bCs/>
+                                <w:sz w:val="20"/>
+                              </w:rPr>
+                            </w:pPr>
+                            <w:r>
+                              <w:rPr>
+                                <w:rFonts w:ascii="Verdana" w:hAnsi="Verdana" w:cs="Arial"/>
+                                <w:b/>
+                                <w:bCs/>
+                                <w:sz w:val="20"/>
+                              </w:rPr>
+                              <w:t>POLÍCIA MILITAR DA BAHIA</w:t>
+                            </w:r>
+                          </w:p>
+                          <w:p>
+                            <w:pPr>
+                              <w:spacing w:after="60"/>
+                              <w:jc w:val="center"/>
+                              <w:rPr>
+                                <w:rFonts w:ascii="Verdana" w:hAnsi="Verdana" w:cs="Arial"/>
+                                <w:b/>
+                                <w:bCs/>
+                                <w:sz w:val="20"/>
+                              </w:rPr>
+                            </w:pPr>
+                            <w:r>
+                              <w:rPr>
+                                <w:rFonts w:ascii="Verdana" w:hAnsi="Verdana" w:cs="Arial"/>
+                                <w:b/>
+                                <w:bCs/>
+                                <w:sz w:val="20"/>
+                              </w:rPr>
+                              <w:t>COMANDO DE OPERAÇÕES PM</w:t>
+                            </w:r>
+                          </w:p>
+                          <w:p>
+                            <w:pPr>
+                              <w:spacing w:after="60"/>
+                              <w:jc w:val="center"/>
+                              <w:rPr>
+                                <w:rFonts w:ascii="Verdana" w:hAnsi="Verdana" w:cs="Arial"/>
+                                <w:bCs/>
+                                <w:sz w:val="20"/>
+                              </w:rPr>
+                            </w:pPr>
+                            <w:r>
+                              <w:rPr>
+                                <w:rFonts w:ascii="Verdana" w:hAnsi="Verdana" w:cs="Arial"/>
+                                <w:bCs/>
+                                <w:sz w:val="20"/>
+                              </w:rPr>
+                              <w:t>CPR</w:t>
+                            </w:r>
+                            <w:r>
+                              <w:rPr>
+                                <w:rFonts w:ascii="Verdana" w:hAnsi="Verdana" w:cs="Arial"/>
+                                <w:bCs/>
+                                <w:sz w:val="20"/>
+                              </w:rPr>
+                              <w:t>-O</w:t>
+                            </w:r>
+                          </w:p>
+                          <w:p>
+                            <w:pPr>
+                              <w:spacing w:after="60"/>
+                              <w:jc w:val="center"/>
+                              <w:rPr>
+                                <w:rFonts w:ascii="Verdana" w:hAnsi="Verdana" w:cs="Arial"/>
+                                <w:bCs/>
+                                <w:sz w:val="20"/>
+                              </w:rPr>
+                            </w:pPr>
+                            <w:r>
+                              <w:rPr>
+                                <w:rFonts w:ascii="Verdana" w:hAnsi="Verdana" w:cs="Arial"/>
+                                <w:bCs/>
+                                <w:sz w:val="20"/>
+                              </w:rPr>
+                              <w:t>27º BPM - CPO</w:t>
+                            </w:r>
+                            <w:r>
+                              <w:rPr>
+                                <w:rFonts w:ascii="Verdana" w:hAnsi="Verdana" w:cs="Arial"/>
+                                <w:bCs/>
+                                <w:sz w:val="20"/>
+                              </w:rPr>
+                              <w:t>I</w:t>
+                            </w:r>
+                            <w:r>
+                              <w:rPr>
+                                <w:rFonts w:ascii="Verdana" w:hAnsi="Verdana" w:cs="Arial"/>
+                                <w:bCs/>
+                                <w:sz w:val="20"/>
+                              </w:rPr>
+                              <w:t xml:space="preserve"> </w:t>
+                            </w:r>
+                          </w:p>
+                        </w:txbxContent>
+                      </wps:txbx>
+                      <wps:bodyPr rot="0" vert="horz" wrap="square" lIns="91440" tIns="45720" rIns="91440" bIns="45720" anchor="t" anchorCtr="0" upright="1">
+                        <a:noAutofit/>
+                      </wps:bodyPr>
+                    </wps:wsp>
+                  </a:graphicData>
+                </a:graphic>
+                <wp14:sizeRelH relativeFrom="page">
+                  <wp14:pctWidth>0</wp14:pctWidth>
+                </wp14:sizeRelH>
+                <wp14:sizeRelV relativeFrom="page">
+                  <wp14:pctHeight>0</wp14:pctHeight>
+                </wp14:sizeRelV>
+              </wp:anchor>
+            </w:drawing>
+          </mc:Choice>
+          <mc:Fallback>
+            <w:pict>
+              <v:shape w14:anchorId="0AFCEDE7" id="Caixa de Texto 2" o:spid="_x0000_s1027" type="#_x0000_t202" style="position:absolute;left:0;text-align:left;margin-left:-19.35pt;margin-top:.15pt;width:330.45pt;height:75.75pt;z-index:251660288;visibility:visible;mso-wrap-style:square;mso-width-percent:0;mso-height-percent:0;mso-wrap-distance-left:9pt;mso-wrap-distance-top:0;mso-wrap-distance-right:9pt;mso-wrap-distance-bottom:0;mso-position-horizontal:absolute;mso-position-horizontal-relative:text;mso-position-vertical:absolute;mso-position-vertical-relative:text;mso-width-percent:0;mso-height-percent:0;mso-width-relative:page;mso-height-relative:page;v-text-anchor:top" o:gfxdata="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" stroked="f">
+                <v:textbox>
+                  <w:txbxContent>
+                    <w:p>
+                      <w:pPr>
+                        <w:spacing w:after="60"/>
+                        <w:jc w:val="center"/>
+                        <w:rPr>
+                          <w:rFonts w:ascii="Verdana" w:hAnsi="Verdana" w:cs="Arial"/>
+                          <w:b/>
+                          <w:bCs/>
+                          <w:sz w:val="20"/>
+                        </w:rPr>
+                      </w:pPr>
+                      <w:r>
+                        <w:rPr>
+                          <w:rFonts w:ascii="Verdana" w:hAnsi="Verdana" w:cs="Arial"/>
+                          <w:b/>
+                          <w:bCs/>
+                          <w:sz w:val="20"/>
+                        </w:rPr>
+                        <w:t>POLÍCIA MILITAR DA BAHIA</w:t>
+                      </w:r>
+                    </w:p>
+                    <w:p>
+                      <w:pPr>
+                        <w:spacing w:after="60"/>
+                        <w:jc w:val="center"/>
+                        <w:rPr>
+                          <w:rFonts w:ascii="Verdana" w:hAnsi="Verdana" w:cs="Arial"/>
+                          <w:b/>
+                          <w:bCs/>
+                          <w:sz w:val="20"/>
+                        </w:rPr>
+                      </w:pPr>
+                      <w:r>
+                        <w:rPr>
+                          <w:rFonts w:ascii="Verdana" w:hAnsi="Verdana" w:cs="Arial"/>
+                          <w:b/>
+                          <w:bCs/>
+                          <w:sz w:val="20"/>
+                        </w:rPr>
+                        <w:t>COMANDO DE OPERAÇÕES PM</w:t>
+                      </w:r>
+                    </w:p>
+                    <w:p>
+                      <w:pPr>
+                        <w:spacing w:after="60"/>
+                        <w:jc w:val="center"/>
+                        <w:rPr>
+                          <w:rFonts w:ascii="Verdana" w:hAnsi="Verdana" w:cs="Arial"/>
+                          <w:bCs/>
+                          <w:sz w:val="20"/>
+                        </w:rPr>
+                      </w:pPr>
+                      <w:r>
+                        <w:rPr>
+                          <w:rFonts w:ascii="Verdana" w:hAnsi="Verdana" w:cs="Arial"/>
+                          <w:bCs/>
+                          <w:sz w:val="20"/>
+                        </w:rPr>
+                        <w:t>CPR</w:t>
+                      </w:r>
+                      <w:r>
+                        <w:rPr>
+                          <w:rFonts w:ascii="Verdana" w:hAnsi="Verdana" w:cs="Arial"/>
+                          <w:bCs/>
+                          <w:sz w:val="20"/>
+                        </w:rPr>
+                        <w:t>-O</w:t>
+                      </w:r>
+                    </w:p>
+                    <w:p>
+                      <w:pPr>
+                        <w:spacing w:after="60"/>
+                        <w:jc w:val="center"/>
+                        <w:rPr>
+                          <w:rFonts w:ascii="Verdana" w:hAnsi="Verdana" w:cs="Arial"/>
+                          <w:bCs/>
+                          <w:sz w:val="20"/>
+                        </w:rPr>
+                      </w:pPr>
+                      <w:r>
+                        <w:rPr>
+                          <w:rFonts w:ascii="Verdana" w:hAnsi="Verdana" w:cs="Arial"/>
+                          <w:bCs/>
+                          <w:sz w:val="20"/>
+                        </w:rPr>
+                        <w:t>27º BPM - CPO</w:t>
+                      </w:r>
+                      <w:r>
+                        <w:rPr>
+                          <w:rFonts w:ascii="Verdana" w:hAnsi="Verdana" w:cs="Arial"/>
+                          <w:bCs/>
+                          <w:sz w:val="20"/>
+                        </w:rPr>
+                        <w:t>I</w:t>
+                      </w:r>
+                      <w:r>
+                        <w:rPr>
+                          <w:rFonts w:ascii="Verdana" w:hAnsi="Verdana" w:cs="Arial"/>
+                          <w:bCs/>
+                          <w:sz w:val="20"/>
+                        </w:rPr>
+                        <w:t xml:space="preserve"> </w:t>
+                      </w:r>
+                    </w:p>
+                  </w:txbxContent>
+                </v:textbox>
+              </v:shape>
+            </w:pict>
+          </mc:Fallback>
+        </mc:AlternateContent>
       </w:r>
       <w:r>
         <w:rPr>
@@ -48,54 +955,117 @@
           <w:sz w:val="20"/>
           <w:lang w:eastAsia="pt-BR"/>
         </w:rPr>
+        <w:drawing>
+          <wp:anchor distT="0" distB="0" distL="114300" distR="114300" simplePos="0" relativeHeight="251664384" behindDoc="0" locked="0" layoutInCell="1" allowOverlap="1" wp14:anchorId="301DD3A6" wp14:editId="1E8DF1DD">
+            <wp:simplePos x="0" y="0"/>
+            <wp:positionH relativeFrom="column">
+              <wp:posOffset>-547370</wp:posOffset>
+            </wp:positionH>
+            <wp:positionV relativeFrom="paragraph">
+              <wp:posOffset>1482</wp:posOffset>
+            </wp:positionV>
+            <wp:extent cx="799200" cy="720000"/>
+            <wp:effectExtent l="0" t="0" r="1270" b="4445"/>
+            <wp:wrapSquare wrapText="bothSides"/>
+            <wp:docPr id="1" name="Imagem 3"/>
+            <wp:cNvGraphicFramePr>
+              <a:graphicFrameLocks xmlns:a="http://schemas.openxmlformats.org/drawingml/2006/main" noChangeAspect="1"/>
+            </wp:cNvGraphicFramePr>
+            <a:graphic xmlns:a="http://schemas.openxmlformats.org/drawingml/2006/main">
+              <a:graphicData uri="http://schemas.openxmlformats.org/drawingml/2006/picture">
+                <pic:pic xmlns:pic="http://schemas.openxmlformats.org/drawingml/2006/picture">
+                  <pic:nvPicPr>
+                    <pic:cNvPr id="1" name="BRASAO_PM.jpg"/>
+                    <pic:cNvPicPr/>
+                  </pic:nvPicPr>
+                  <pic:blipFill>
+                    <a:blip r:embed="rId9" cstate="print">
+                      <a:extLst>
+                        <a:ext uri="{28A0092B-C50C-407E-A947-70E740481C1C}">
+                          <a14:useLocalDpi xmlns:a14="http://schemas.microsoft.com/office/drawing/2010/main" val="0"/>
+                        </a:ext>
+                      </a:extLst>
+                    </a:blip>
+                    <a:stretch>
+                      <a:fillRect/>
+                    </a:stretch>
+                  </pic:blipFill>
+                  <pic:spPr>
+                    <a:xfrm>
+                      <a:off x="0" y="0"/>
+                      <a:ext cx="799200" cy="720000"/>
+                    </a:xfrm>
+                    <a:prstGeom prst="rect">
+                      <a:avLst/>
+                    </a:prstGeom>
+                  </pic:spPr>
+                </pic:pic>
+              </a:graphicData>
+            </a:graphic>
+            <wp14:sizeRelH relativeFrom="margin">
+              <wp14:pctWidth>0</wp14:pctWidth>
+            </wp14:sizeRelH>
+            <wp14:sizeRelV relativeFrom="margin">
+              <wp14:pctHeight>0</wp14:pctHeight>
+            </wp14:sizeRelV>
+          </wp:anchor>
+        </w:drawing>
       </w:r>
       <w:r>
         <w:rPr>
           <w:color w:val="000000" w:themeColor="text1"/>
           <w:sz w:val="24"/>
         </w:rPr>
+        <w:t>ESTUDO DE SITUAÇÃO</w:t>
       </w:r>
       <w:r>
         <w:rPr>
           <w:color w:val="000000" w:themeColor="text1"/>
           <w:sz w:val="24"/>
         </w:rPr>
+        <w:t xml:space="preserve"> </w:t>
       </w:r>
       <w:r>
         <w:rPr>
           <w:color w:val="000000" w:themeColor="text1"/>
           <w:sz w:val="24"/>
         </w:rPr>
+        <w:t xml:space="preserve">Nº </w:t>
       </w:r>
       <w:r>
         <w:rPr>
           <w:color w:val="000000" w:themeColor="text1"/>
           <w:sz w:val="24"/>
         </w:rPr>
+        <w:t>___</w:t>
       </w:r>
       <w:r>
         <w:rPr>
           <w:color w:val="000000" w:themeColor="text1"/>
           <w:sz w:val="24"/>
         </w:rPr>
+        <w:t/>
       </w:r>
       <w:r>
         <w:rPr>
           <w:color w:val="000000" w:themeColor="text1"/>
           <w:sz w:val="24"/>
         </w:rPr>
+        <w:t>/</w:t>
       </w:r>
       <w:r>
         <w:rPr>
           <w:color w:val="000000" w:themeColor="text1"/>
           <w:sz w:val="24"/>
         </w:rPr>
+        <w:t>202</w:t>
       </w:r>
       <w:r>
         <w:rPr>
           <w:color w:val="000000" w:themeColor="text1"/>
           <w:sz w:val="24"/>
         </w:rPr>
+        <w:t>6</w:t>
       </w:r>
     </w:p>
     <w:p>
@@ -122,7 +1092,7 @@
           <w:sz w:val="16"/>
           <w:szCs w:val="16"/>
         </w:rPr>
-        <w:t>“Operação 2x2 – 10ª Edição”</w:t>
+        <w:t xml:space="preserve">“Operação 2x2 – 10ª Edição”</w:t>
       </w:r>
     </w:p>
     <w:p>
@@ -190,63 +1160,70 @@
           <w:sz w:val="20"/>
           <w:szCs w:val="20"/>
         </w:rPr>
-        <w:t>O presente estudo tem como objetivo analisar a viabilidade de implementação da 10ª edição da Operação denominada 2x2, de motopatrulhamento, nos municípios de Luís Eduardo Magalhães e São Desidério e no Distrito de Roda Velha, no período de 01 de novembro de 2026 a 31 de janeiro de 2027.</w:t>
-      </w:r>
-      <w:r>
-        <w:rPr>
-          <w:rFonts w:ascii="Verdana" w:hAnsi="Verdana"/>
-          <w:color w:val="000000" w:themeColor="text1"/>
-          <w:sz w:val="20"/>
-          <w:szCs w:val="20"/>
-        </w:rPr>
-      </w:r>
-      <w:r>
-        <w:rPr>
-          <w:rFonts w:ascii="Verdana" w:hAnsi="Verdana"/>
-          <w:color w:val="000000" w:themeColor="text1"/>
-          <w:sz w:val="20"/>
-          <w:szCs w:val="20"/>
-        </w:rPr>
-      </w:r>
-      <w:r>
-        <w:rPr>
-          <w:rFonts w:ascii="Verdana" w:hAnsi="Verdana"/>
-          <w:color w:val="000000" w:themeColor="text1"/>
-          <w:sz w:val="20"/>
-          <w:szCs w:val="20"/>
-        </w:rPr>
-      </w:r>
-      <w:r>
-        <w:rPr>
-          <w:rFonts w:ascii="Verdana" w:hAnsi="Verdana"/>
-          <w:color w:val="000000" w:themeColor="text1"/>
-          <w:sz w:val="20"/>
-          <w:szCs w:val="20"/>
-        </w:rPr>
-      </w:r>
-      <w:r>
-        <w:rPr>
-          <w:rFonts w:ascii="Verdana" w:hAnsi="Verdana"/>
-          <w:color w:val="000000" w:themeColor="text1"/>
-          <w:sz w:val="20"/>
-          <w:szCs w:val="20"/>
-        </w:rPr>
-      </w:r>
-      <w:r>
-        <w:rPr>
-          <w:rFonts w:ascii="Verdana" w:hAnsi="Verdana"/>
-          <w:color w:val="000000" w:themeColor="text1"/>
-          <w:sz w:val="20"/>
-          <w:szCs w:val="20"/>
-        </w:rPr>
-      </w:r>
-      <w:r>
-        <w:rPr>
-          <w:rFonts w:ascii="Verdana" w:hAnsi="Verdana"/>
-          <w:color w:val="000000" w:themeColor="text1"/>
-          <w:sz w:val="20"/>
-          <w:szCs w:val="20"/>
-        </w:rPr>
+        <w:t xml:space="preserve">O presente estudo tem como objetivo analisar a viabilidade de implementação da 10ª edição da Operação denominada 2x2, de motopatrulhamento, nos municípios de Luís Eduardo Magalhães e São Desidério e no Distrito de Roda Velha, no período de 01 de novembro de 2026 a 31 de janeiro de 2027.</w:t>
+      </w:r>
+      <w:r>
+        <w:rPr>
+          <w:rFonts w:ascii="Verdana" w:hAnsi="Verdana"/>
+          <w:color w:val="000000" w:themeColor="text1"/>
+          <w:sz w:val="20"/>
+          <w:szCs w:val="20"/>
+        </w:rPr>
+        <w:t xml:space="preserve"/>
+      </w:r>
+      <w:r>
+        <w:rPr>
+          <w:rFonts w:ascii="Verdana" w:hAnsi="Verdana"/>
+          <w:color w:val="000000" w:themeColor="text1"/>
+          <w:sz w:val="20"/>
+          <w:szCs w:val="20"/>
+        </w:rPr>
+        <w:t/>
+      </w:r>
+      <w:r>
+        <w:rPr>
+          <w:rFonts w:ascii="Verdana" w:hAnsi="Verdana"/>
+          <w:color w:val="000000" w:themeColor="text1"/>
+          <w:sz w:val="20"/>
+          <w:szCs w:val="20"/>
+        </w:rPr>
+        <w:t xml:space="preserve"/>
+      </w:r>
+      <w:r>
+        <w:rPr>
+          <w:rFonts w:ascii="Verdana" w:hAnsi="Verdana"/>
+          <w:color w:val="000000" w:themeColor="text1"/>
+          <w:sz w:val="20"/>
+          <w:szCs w:val="20"/>
+        </w:rPr>
+        <w:t xml:space="preserve"/>
+      </w:r>
+      <w:r>
+        <w:rPr>
+          <w:rFonts w:ascii="Verdana" w:hAnsi="Verdana"/>
+          <w:color w:val="000000" w:themeColor="text1"/>
+          <w:sz w:val="20"/>
+          <w:szCs w:val="20"/>
+        </w:rPr>
+        <w:t xml:space="preserve"/>
+      </w:r>
+      <w:r>
+        <w:rPr>
+          <w:rFonts w:ascii="Verdana" w:hAnsi="Verdana"/>
+          <w:color w:val="000000" w:themeColor="text1"/>
+          <w:sz w:val="20"/>
+          <w:szCs w:val="20"/>
+        </w:rPr>
+        <w:t/>
+      </w:r>
+      <w:r>
+        <w:rPr>
+          <w:rFonts w:ascii="Verdana" w:hAnsi="Verdana"/>
+          <w:color w:val="000000" w:themeColor="text1"/>
+          <w:sz w:val="20"/>
+          <w:szCs w:val="20"/>
+        </w:rPr>
+        <w:t xml:space="preserve"/>
       </w:r>
     </w:p>
     <w:p>
@@ -318,7 +1295,7 @@
           <w:sz w:val="20"/>
           <w:szCs w:val="20"/>
         </w:rPr>
-        <w:t>Além disso, o crescimento urbano acelerado e a expansão dos bairros periféricos exigem uma presença policial mais dinâmica e capaz de atuar em locais de difícil acesso para viaturas de quatro rodas. As motocicletas possibilitam o deslocamento por ruas estreitas, terrenos não pavimentados e áreas de alta densidade populacional, promovendo uma sensação de segurança mais imediata à população. Esse modelo de policiamento também favorece a realização de abordagens rápidas, acompanhamentos e operações de prevenção a crimes, como furtos, roubos e o tráfico de entorpecentes.</w:t>
+        <w:t xml:space="preserve">Além disso, o crescimento urbano acelerado e a expansão dos bairros periféricos exigem uma presença policial mais dinâmica e capaz de atuar em locais de difícil acesso para viaturas de quatro rodas. As motocicletas possibilitam o deslocamento por ruas estreitas, terrenos não pavimentados e áreas de alta densidade populacional, promovendo uma sensação de segurança mais imediata à população. Esse modelo de policiamento também favorece a realização de abordagens rápidas, acompanhamentos e operações de prevenção a crimes, como furtos, roubos e o tráfico de entorpecentes.</w:t>
       </w:r>
     </w:p>
     <w:p>
@@ -362,7 +1339,7 @@
           <w:sz w:val="20"/>
           <w:szCs w:val="20"/>
         </w:rPr>
-        <w:t>Paralelo a isso, faz-se necessária a aplicação do policiamento no Município de São Desidério e no Distrito de Roda Velha, localidades que contam apenas com uma viatura policial com guarnição tipo B, sendo necessário suplemento de efetivo para a realização do policiamento nos dias de maior movimento de pessoas.</w:t>
+        <w:t xml:space="preserve">Paralelo a isso, faz-se necessária a aplicação do policiamento no Município de São Desidério e no Distrito de Roda Velha, localidades que contam apenas com uma viatura policial com guarnição tipo B, sendo necessário suplemento de efetivo para a realização do policiamento nos dias de maior movimento de pessoas.</w:t>
       </w:r>
     </w:p>
     <w:p>
@@ -766,7 +1743,7 @@
           <w:sz w:val="20"/>
           <w:szCs w:val="20"/>
         </w:rPr>
-        <w:t>FATOS QUE CONDUZEM AO PROBLEMA</w:t>
+        <w:t xml:space="preserve">FATOS QUE CONDUZEM AO PROBLEMA</w:t>
       </w:r>
     </w:p>
     <w:p>
@@ -915,43 +1892,7 @@
           <w:sz w:val="20"/>
           <w:szCs w:val="20"/>
         </w:rPr>
-        <w:t xml:space="preserve">Ação de facções criminosas </w:t>
-      </w:r>
-      <w:r>
-        <w:rPr>
-          <w:rFonts w:ascii="Verdana" w:hAnsi="Verdana"/>
-          <w:color w:val="000000" w:themeColor="text1"/>
-          <w:sz w:val="20"/>
-          <w:szCs w:val="20"/>
-        </w:rPr>
-        <w:t>com predominância de tráfico de drogas</w:t>
-      </w:r>
-      <w:r>
-        <w:rPr>
-          <w:rFonts w:ascii="Verdana" w:hAnsi="Verdana"/>
-          <w:color w:val="000000" w:themeColor="text1"/>
-          <w:sz w:val="20"/>
-          <w:szCs w:val="20"/>
-        </w:rPr>
-        <w:t>;</w:t>
-      </w:r>
-      <w:r>
-        <w:rPr>
-          <w:rFonts w:ascii="Verdana" w:hAnsi="Verdana"/>
-          <w:color w:val="000000" w:themeColor="text1"/>
-          <w:sz w:val="20"/>
-          <w:szCs w:val="20"/>
-        </w:rPr>
-        <w:t xml:space="preserve"> </w:t>
-      </w:r>
-      <w:r>
-        <w:rPr>
-          <w:rFonts w:ascii="Verdana" w:hAnsi="Verdana"/>
-          <w:color w:val="000000" w:themeColor="text1"/>
-          <w:sz w:val="20"/>
-          <w:szCs w:val="20"/>
-        </w:rPr>
-        <w:t xml:space="preserve">  </w:t>
+        <w:t xml:space="preserve">Efetivo reduzido em São Desidério e no Distrito de Roda Velha, atendidos por apenas uma viatura com guarnição tipo B;</w:t>
       </w:r>
     </w:p>
     <w:p>
@@ -979,39 +1920,43 @@
           <w:sz w:val="20"/>
           <w:szCs w:val="20"/>
         </w:rPr>
-        <w:t>Efetivo reduzido em São Desidério e no Distrito de Roda Velha, atendidos por apenas uma viatura com guarnição tipo B;</w:t>
-      </w:r>
-      <w:r>
-        <w:rPr>
-          <w:rFonts w:ascii="Verdana" w:hAnsi="Verdana"/>
-          <w:color w:val="000000" w:themeColor="text1"/>
-          <w:sz w:val="20"/>
-          <w:szCs w:val="20"/>
-        </w:rPr>
-      </w:r>
-      <w:r>
-        <w:rPr>
-          <w:rFonts w:ascii="Verdana" w:hAnsi="Verdana"/>
-          <w:color w:val="000000" w:themeColor="text1"/>
-          <w:sz w:val="20"/>
-          <w:szCs w:val="20"/>
-        </w:rPr>
-      </w:r>
-      <w:r>
-        <w:rPr>
-          <w:rFonts w:ascii="Verdana" w:hAnsi="Verdana"/>
-          <w:color w:val="000000" w:themeColor="text1"/>
-          <w:sz w:val="20"/>
-          <w:szCs w:val="20"/>
-        </w:rPr>
-      </w:r>
-      <w:r>
-        <w:rPr>
-          <w:rFonts w:ascii="Verdana" w:hAnsi="Verdana"/>
-          <w:color w:val="000000" w:themeColor="text1"/>
-          <w:sz w:val="20"/>
-          <w:szCs w:val="20"/>
-        </w:rPr>
+        <w:t xml:space="preserve">Ação de facções criminosas </w:t>
+      </w:r>
+      <w:r>
+        <w:rPr>
+          <w:rFonts w:ascii="Verdana" w:hAnsi="Verdana"/>
+          <w:color w:val="000000" w:themeColor="text1"/>
+          <w:sz w:val="20"/>
+          <w:szCs w:val="20"/>
+        </w:rPr>
+        <w:t>com predominância de tráfico de drogas</w:t>
+      </w:r>
+      <w:r>
+        <w:rPr>
+          <w:rFonts w:ascii="Verdana" w:hAnsi="Verdana"/>
+          <w:color w:val="000000" w:themeColor="text1"/>
+          <w:sz w:val="20"/>
+          <w:szCs w:val="20"/>
+        </w:rPr>
+        <w:t>;</w:t>
+      </w:r>
+      <w:r>
+        <w:rPr>
+          <w:rFonts w:ascii="Verdana" w:hAnsi="Verdana"/>
+          <w:color w:val="000000" w:themeColor="text1"/>
+          <w:sz w:val="20"/>
+          <w:szCs w:val="20"/>
+        </w:rPr>
+        <w:t xml:space="preserve"> </w:t>
+      </w:r>
+      <w:r>
+        <w:rPr>
+          <w:rFonts w:ascii="Verdana" w:hAnsi="Verdana"/>
+          <w:color w:val="000000" w:themeColor="text1"/>
+          <w:sz w:val="20"/>
+          <w:szCs w:val="20"/>
+        </w:rPr>
+        <w:t xml:space="preserve">  </w:t>
       </w:r>
     </w:p>
     <w:p>
@@ -1223,7 +2168,7 @@
           <w:sz w:val="20"/>
           <w:szCs w:val="20"/>
         </w:rPr>
-        <w:t>Reforço em São Desidério e Roda Velha – O emprego da operação supre a limitação de efetivo dessas localidades, ampliando a presença policial nos dias de maior movimento de pessoas.</w:t>
+        <w:t xml:space="preserve">Reforço em São Desidério e Roda Velha – O emprego da operação supre a limitação de efetivo dessas localidades, ampliando a presença policial nos dias de maior movimento de pessoas.</w:t>
       </w:r>
     </w:p>
     <w:p>
@@ -1252,7 +2197,7 @@
           <w:sz w:val="20"/>
           <w:szCs w:val="20"/>
         </w:rPr>
-        <w:t>Custo e efetivo – Prevê-se o emprego de 04 (quatro) policiais militares (01 CB PM e 03 SD PM), no turno das 14h às 22h, em regime de hora extra (08 horas por policial), durante 09 (nove) dias por mês, com custo mensal estimado de R$ 10.359,36 e custo total de R$ 31.078,08 nos três meses (novembro/2026 a janeiro/2027), conforme planilha anexa ao Plano de Operações nº 020/2026.</w:t>
+        <w:t xml:space="preserve">Custo e efetivo – Prevê-se o emprego de 04 (quatro) policiais militares (01 CB PM e 03 SD PM), no turno das 14h às 22h, em regime de hora extra (08 horas por policial), durante 09 (nove) dias por mês, com custo mensal estimado de R$ 10.359,36 e custo total de R$ 31.078,08 no período de novembro/2026 a janeiro/2027, conforme Anexo A do Plano de Operações nº 020/2026.</w:t>
       </w:r>
     </w:p>
     <w:p>
@@ -1321,55 +2266,62 @@
           <w:sz w:val="20"/>
           <w:szCs w:val="20"/>
         </w:rPr>
-        <w:t>Diante das informações colhidas, recomenda-se a execução da 10ª edição da Operação 2x2, com o emprego de guarnições de motopatrulhamento em Luís Eduardo Magalhães, São Desidério e no Distrito de Roda Velha, no período de 01 de novembro de 2026 a 31 de janeiro de 2027, em regime de hora extra, a fim de que não traga solução de continuidade ao serviço ordinário, bem como a solicitação ao CPR-O de suplementação de combustível para as viaturas duas rodas empregadas, nos termos do Plano de Operações nº 020/2026.</w:t>
-      </w:r>
-      <w:r>
-        <w:rPr>
-          <w:rFonts w:ascii="Verdana" w:hAnsi="Verdana"/>
-          <w:color w:val="000000" w:themeColor="text1"/>
-          <w:sz w:val="20"/>
-          <w:szCs w:val="20"/>
-        </w:rPr>
-      </w:r>
-      <w:r>
-        <w:rPr>
-          <w:rFonts w:ascii="Verdana" w:hAnsi="Verdana"/>
-          <w:color w:val="000000" w:themeColor="text1"/>
-          <w:sz w:val="20"/>
-          <w:szCs w:val="20"/>
-        </w:rPr>
-      </w:r>
-      <w:r>
-        <w:rPr>
-          <w:rFonts w:ascii="Verdana" w:hAnsi="Verdana"/>
-          <w:color w:val="000000" w:themeColor="text1"/>
-          <w:sz w:val="20"/>
-          <w:szCs w:val="20"/>
-        </w:rPr>
-      </w:r>
-      <w:r>
-        <w:rPr>
-          <w:rFonts w:ascii="Verdana" w:hAnsi="Verdana"/>
-          <w:color w:val="000000" w:themeColor="text1"/>
-          <w:sz w:val="20"/>
-          <w:szCs w:val="20"/>
-        </w:rPr>
-      </w:r>
-      <w:r>
-        <w:rPr>
-          <w:rFonts w:ascii="Verdana" w:hAnsi="Verdana"/>
-          <w:color w:val="000000" w:themeColor="text1"/>
-          <w:sz w:val="20"/>
-          <w:szCs w:val="20"/>
-        </w:rPr>
-      </w:r>
-      <w:r>
-        <w:rPr>
-          <w:rFonts w:ascii="Verdana" w:hAnsi="Verdana"/>
-          <w:color w:val="000000" w:themeColor="text1"/>
-          <w:sz w:val="20"/>
-          <w:szCs w:val="20"/>
-        </w:rPr>
+        <w:lastRenderedPageBreak/>
+        <w:t xml:space="preserve">Diante das informações colhidas, recomenda-se a execução da 10ª edição da Operação 2x2, com o emprego de guarnições de motopatrulhamento em Luís Eduardo Magalhães, São Desidério e no Distrito de Roda Velha, no período de 01 de novembro de 2026 a 31 de janeiro de 2027, em regime de hora extra, a fim de que não traga solução de continuidade ao serviço ordinário, bem como a solicitação ao CPR-O de suplementação de combustível para as viaturas duas rodas empregadas, nos termos do Plano de Operações nº 020/2026.</w:t>
+      </w:r>
+      <w:r>
+        <w:rPr>
+          <w:rFonts w:ascii="Verdana" w:hAnsi="Verdana"/>
+          <w:color w:val="000000" w:themeColor="text1"/>
+          <w:sz w:val="20"/>
+          <w:szCs w:val="20"/>
+        </w:rPr>
+        <w:t/>
+      </w:r>
+      <w:r>
+        <w:rPr>
+          <w:rFonts w:ascii="Verdana" w:hAnsi="Verdana"/>
+          <w:color w:val="000000" w:themeColor="text1"/>
+          <w:sz w:val="20"/>
+          <w:szCs w:val="20"/>
+        </w:rPr>
+        <w:t xml:space="preserve"/>
+      </w:r>
+      <w:r>
+        <w:rPr>
+          <w:rFonts w:ascii="Verdana" w:hAnsi="Verdana"/>
+          <w:color w:val="000000" w:themeColor="text1"/>
+          <w:sz w:val="20"/>
+          <w:szCs w:val="20"/>
+        </w:rPr>
+        <w:t/>
+      </w:r>
+      <w:r>
+        <w:rPr>
+          <w:rFonts w:ascii="Verdana" w:hAnsi="Verdana"/>
+          <w:color w:val="000000" w:themeColor="text1"/>
+          <w:sz w:val="20"/>
+          <w:szCs w:val="20"/>
+        </w:rPr>
+        <w:t xml:space="preserve"/>
+      </w:r>
+      <w:r>
+        <w:rPr>
+          <w:rFonts w:ascii="Verdana" w:hAnsi="Verdana"/>
+          <w:color w:val="000000" w:themeColor="text1"/>
+          <w:sz w:val="20"/>
+          <w:szCs w:val="20"/>
+        </w:rPr>
+        <w:t/>
+      </w:r>
+      <w:r>
+        <w:rPr>
+          <w:rFonts w:ascii="Verdana" w:hAnsi="Verdana"/>
+          <w:color w:val="000000" w:themeColor="text1"/>
+          <w:sz w:val="20"/>
+          <w:szCs w:val="20"/>
+        </w:rPr>
+        <w:t xml:space="preserve"/>
       </w:r>
     </w:p>
     <w:p>
@@ -1498,8 +2450,8 @@
             <wp:positionH relativeFrom="margin">
               <wp:posOffset>2558415</wp:posOffset>
             </wp:positionH>
-            <wp:positionV relativeFrom="margin">
-              <wp:posOffset>1788160</wp:posOffset>
+            <wp:positionV relativeFrom="paragraph">
+              <wp:posOffset>0</wp:posOffset>
             </wp:positionV>
             <wp:extent cx="790575" cy="1343025"/>
             <wp:effectExtent l="0" t="0" r="9525" b="9525"/>

</xml_diff>